<commit_message>
Tighten proposal precision and abstract
</commit_message>
<xml_diff>
--- a/papers/candidates/Invisible_Ledger_Proposal_Polished_2026-09-17.docx
+++ b/papers/candidates/Invisible_Ledger_Proposal_Polished_2026-09-17.docx
@@ -153,7 +153,7 @@
           <w:i w:val="0"/>
           <w:sz w:val="24"/>
         </w:rPr>
-        <w:t>Digital economy is measured through several records: the transaction value platforms process, the revenue they recognize, national e-commerce statistics and payment data. These records are often used interchangeably, yet each captures a different part of the same activity. This study asks how much economic activity remains invisible when digital platforms are measured through their reported revenue. I define the invisible wedge as the difference between transaction value and platform-recognized revenue and follow it across Indonesian platforms from 2020 to 2025. In 2023, Tokopedia, Shopee and Grab processed US$43.23 billion of transaction value against US$3.16 billion of recognized revenue. The relationship is not stable: among the platforms that report both figures themselves, revenue grew faster than transaction value in six of eight year-to-year comparisons and moved in the opposite direction in two. National statistics and payment records disagree with the platform picture and with each other. BPS-Statistics Indonesia, using its own definitions, reports a 2023 marketplace figure below the transaction value of Tokopedia and Shopee alone and places 98.5 percent of 2023–2024 e-commerce growth outside its marketplace category, while payment measures grew up to eleven times as fast. Eight platform businesses outside Indonesia show the same transaction-revenue distinction with smaller year-to-year divergence. The proposal compares these records rather than treating any one of them as the measure of digital activity.</w:t>
+        <w:t>Digital economy is measured through several records: the transaction value platforms process, the revenue they recognize, national e-commerce statistics and payment data. These records capture parts of the same activity. This study defines the invisible wedge as transaction value minus platform-recognized revenue and follows it across Indonesian platforms from 2020 to 2025. In 2023, Tokopedia, Shopee and Grab processed US$43.23 billion against US$3.16 billion of recognized revenue. The relationship was unstable: among platforms reporting both figures, revenue grew faster in six of eight year-to-year comparisons and moved in the opposite direction in two. BPS-Statistics Indonesia reports a 2023 marketplace figure below Tokopedia and Shopee's transaction value alone and places 98.5 percent of 2023–2024 e-commerce growth outside its marketplace category. Payment measures grew up to eleven times as fast. Eight platforms outside Indonesia show the transaction-revenue distinction with smaller divergence. Thus, conclusions about scale and growth depend on the record used.</w:t>
       </w:r>
     </w:p>
     <w:p>
@@ -186,7 +186,7 @@
           <w:i w:val="0"/>
           <w:sz w:val="24"/>
         </w:rPr>
-        <w:t>Southeast Asia's digital economy grew from approximately US$100 billion in 2020 to US$263 billion in 2024 (Google, Temasek and Bain 2020, 2024). That figure is one record of the activity: the gross value of the transactions involved. The platforms that carry those transactions report a different number, their own revenue; national statistical agencies report a third, the online sales of surveyed businesses; and payment systems report a fourth, the value of funds moved. Each is correct for what it measures. These measures are often used interchangeably even though they do not measure the same thing. Substituting one for another changes the measured scale, growth and even the direction of digital activity.</w:t>
+        <w:t>Southeast Asia's digital economy grew from approximately US$100 billion in 2020 to US$263 billion in 2024 (Google, Temasek and Bain 2020, 2024). That figure is one record of the activity: the gross value of the transactions involved. The platforms that carry those transactions report a different number, their own revenue; national statistical agencies report a third, the online sales of surveyed businesses; and payment systems report a fourth, the value of funds moved. These records are designed to measure different things, yet they are often used interchangeably. Substituting one for another changes the measured scale, growth and even the direction of digital activity.</w:t>
       </w:r>
     </w:p>
     <w:p>
@@ -201,7 +201,7 @@
           <w:i w:val="0"/>
           <w:sz w:val="24"/>
         </w:rPr>
-        <w:t>Suppose a platform processes 100 units of transaction value but recognizes only 10 as revenue, meaning that only 10 counts as the platform's own revenue in its accounts. Depending on the business model, the remaining 90 can include merchant receipts, driver payouts, inventory costs, taxes and other pass-through payments. An analyst using the platform's accounts sees 10, while one measuring the commerce it processes sees 100. I call the difference the invisible wedge. Neither number is wrong: revenue records what the platform earned, while transaction value records what it carried. The arithmetic is familiar; the measurement problem is that the relationship does not remain fixed.</w:t>
+        <w:t>Suppose a platform processes 100 units of transaction value but recognizes only 10 as its own revenue: the commissions and fees it earns for arranging the transactions. Depending on the business model, the remaining 90 can include merchant receipts, driver payouts, inventory costs, taxes and other pass-through payments. An analyst using the platform's accounts sees 10, while one measuring the commerce it processes sees 100. I call the difference the invisible wedge. Neither number is wrong: revenue records what the platform earned, while transaction value records what it carried. The arithmetic is familiar; the measurement problem is that the relationship does not remain fixed.</w:t>
       </w:r>
     </w:p>
     <w:p>
@@ -246,7 +246,7 @@
           <w:i w:val="0"/>
           <w:sz w:val="24"/>
         </w:rPr>
-        <w:t>A statement about how large Indonesia's digital economy is, or how fast it grew, is therefore a statement about a record. An investor reading platform revenue and an analyst sizing e-commerce from marketplace figures can reach different conclusions about the same years. Neither record is internally wrong; the error lies in treating either one as the measure of the digital economy.</w:t>
+        <w:t>A statement about how large Indonesia's digital economy is, or how fast it grew, is therefore a statement about a record. An investor using platform revenue and an analyst using marketplace figures reach different conclusions about the same years because the records measure different objects. The error lies in treating either one as the measure of the digital economy.</w:t>
       </w:r>
     </w:p>
     <w:p>
@@ -614,7 +614,7 @@
           <w:i w:val="0"/>
           <w:sz w:val="24"/>
         </w:rPr>
-        <w:t>Third-party information changes compliance and enforcement (Kleven et al. 2011; Pomeranz 2015; Naritomi 2019; Kleven, Kreiner and Saez 2016; Slemrod 2019). The OECD Model Rules (OECD 2020) and the European Union's DAC7 regime (European Union 2021) apply this principle to platforms, as does Indonesia's Minister of Finance Regulation No. 37 of 2025 through seller identification, transaction-linked reporting and marketplace withholding (Ministry of Finance of the Republic of Indonesia 2025). The relevance here is informational: what a measure or rule can show depends on the records it uses.</w:t>
+        <w:t>Third-party information changes compliance and enforcement (Kleven et al. 2011; Pomeranz 2015; Naritomi 2019; Kleven, Kreiner and Saez 2016; Slemrod 2019). The OECD Model Rules (OECD 2020) and the European Union's DAC7 regime (European Union 2021) apply this principle to platforms, as does Indonesia's Minister of Finance Regulation No. 37 of 2025 (PMK 37/2025) through seller identification, transaction-linked reporting and marketplace withholding (Ministry of Finance of the Republic of Indonesia 2025). The relevance here is informational: what a measure or rule can show depends on the records it uses.</w:t>
       </w:r>
     </w:p>
     <w:p>
@@ -3004,7 +3004,7 @@
           <w:i w:val="0"/>
           <w:sz w:val="24"/>
         </w:rPr>
-        <w:t>Sea Limited does not report Shopee transaction value separately for Indonesia. Momentum Works supplies the Indonesian estimate; its annual Southeast Asian e-commerce report is widely cited for country-level platform estimates and is used because no issuer discloses the figure. The value is labelled as a third-party estimate wherever it appears, and Indonesian revenue is estimated using Sea's Group service monetization rate:</w:t>
+        <w:t>Sea Limited does not report Shopee transaction value separately for Indonesia. Momentum Works supplies the Indonesian estimate; its annual Southeast Asian e-commerce report is widely cited for country-level platform estimates and is used because no issuer discloses the figure. The value is labeled as a third-party estimate wherever it appears, and Indonesian revenue is estimated using Sea's Group service monetization rate:</w:t>
       </w:r>
     </w:p>
     <w:p>
@@ -4800,7 +4800,7 @@
           <w:i w:val="0"/>
           <w:sz w:val="24"/>
         </w:rPr>
-        <w:t>Blibli and Bukalapak report 2023 wedges of US$3.20 billion and US$10.50 billion but are excluded from the total because their measures include online travel and Group-level activity. Their ratios, 43.4 and 36.0, sit close to Tokopedia's 39.3; the constructed ratios instead reflect company-wide monetization.</w:t>
+        <w:t>At the 2023 exchange rate, Blibli's and Bukalapak's reported transaction and revenue figures yield wedges of US$3.20 billion and US$10.50 billion. They are excluded from the total because their measures include online travel and Group-level activity. Their ratios, 43.4 and 36.0, sit close to Tokopedia's 39.3; the constructed ratios instead reflect company-wide monetization.</w:t>
       </w:r>
     </w:p>
     <w:p>
@@ -4925,7 +4925,7 @@
           <w:i w:val="0"/>
           <w:sz w:val="24"/>
         </w:rPr>
-        <w:t>National statistics give a different account of the same commerce, beginning with its level. BPS measures the online sales reported by surveyed e-commerce businesses, whereas platform transaction value is the gross value of orders processed, and the external Shopee estimate explicitly includes cancelled and returned orders. For 2023, BPS places the marketplace component at Rp200.68 trillion, about US$13.2 billion, in its exclusive channel split, where marketplaces account for 18.2 percent of transaction value. Tokopedia and Shopee alone reported US$37.9 billion. Channel attribution and reporting definitions differ, so the records are not yet like-for-like; the thesis will reconcile those definitions before attributing any remainder to coverage.</w:t>
+        <w:t>National statistics give a different account of the same commerce, beginning with its level. BPS measures online sales reported by surveyed e-commerce businesses; Tokopedia reports GTV, while the external Shopee figure is a GMV estimate. For 2023, BPS places the marketplace component at Rp200.68 trillion, about US$13.2 billion, in its exclusive channel split, where marketplaces account for 18.2 percent of transaction value. Tokopedia's reported GTV and the external Shopee estimate total US$37.9 billion. Because channel attribution and reporting definitions differ, the records are not yet like-for-like. The thesis will reconcile those definitions before attributing any part of the difference to coverage.</w:t>
       </w:r>
     </w:p>
     <w:p>
@@ -5541,7 +5541,7 @@
           <w:i w:val="0"/>
           <w:sz w:val="24"/>
         </w:rPr>
-        <w:t>Indonesia's digital economy is observed through platform accounts, transaction measures, national statistics and payment records, which disagree about scale and growth. Revenue alone can reverse the apparent direction of platform activity, while a marketplace measure can show a different trend from all e-commerce. The contribution is to identify which conclusions depend on the record selected and why no fixed conversion from platform revenue can recover the commerce underneath it, rather than to claim a single missing total.</w:t>
+        <w:t>Indonesia's digital economy is observed through platform accounts, transaction measures, national statistics and payment records, which disagree about scale and growth. Revenue alone can reverse the apparent direction of platform activity, while a marketplace measure can show a different trend from all e-commerce. The contribution is to identify which conclusions depend on the record selected and why no fixed conversion from platform revenue can recover the commerce underneath it.</w:t>
       </w:r>
     </w:p>
     <w:p>

</xml_diff>

<commit_message>
Sync build script with final polish, fix the closing paragraph, re-render with system LibreOffice
Co-Authored-By: Claude Opus 5 <noreply@anthropic.com>
</commit_message>
<xml_diff>
--- a/papers/candidates/Invisible_Ledger_Proposal_Polished_2026-09-17.docx
+++ b/papers/candidates/Invisible_Ledger_Proposal_Polished_2026-09-17.docx
@@ -201,7 +201,7 @@
           <w:i w:val="0"/>
           <w:sz w:val="24"/>
         </w:rPr>
-        <w:t>Suppose a platform processes 100 units of transaction value but recognizes only 10 as its own revenue: the commissions and fees it earns for arranging the transactions. Depending on the business model, the remaining 90 can include merchant receipts, driver payouts, inventory costs, taxes and other pass-through payments. An analyst using the platform's accounts sees 10, while one measuring the commerce it processes sees 100. I call the difference the invisible wedge. Neither number is wrong: revenue records what the platform earned, while transaction value records what it carried. The arithmetic is familiar; the measurement problem is that the relationship does not remain fixed.</w:t>
+        <w:t>Suppose a platform processes 100 units of transaction value but recognizes only 10 as its own revenue: the commissions and fees it earns for arranging the transactions. Depending on the business model, the remaining 90 can include merchant receipts, driver payouts, inventory costs, taxes and other pass-through payments. An analyst using the platform's accounts sees 10, while one measuring the commerce it processes sees 100. I call the difference the invisible wedge. The term refers to what a revenue-only measure excludes, not to unrecorded activity. Revenue records what the platform earned, while transaction value records what it carried. The arithmetic is familiar; the measurement problem is that the relationship does not remain fixed.</w:t>
       </w:r>
     </w:p>
     <w:p>
@@ -216,7 +216,7 @@
           <w:i w:val="0"/>
           <w:sz w:val="24"/>
         </w:rPr>
-        <w:t>Indonesia, the largest digital market in Southeast Asia, shows how far apart these records are. The study covers four marketplaces—Tokopedia, Blibli, Bukalapak and Shopee—plus Grab, whose Indonesian business is mainly delivery and other on-demand services. Tokopedia, Blibli and Bukalapak report both measures themselves. Grab's transaction value uses Indonesian revenue and its company-wide ratio; Shopee combines Momentum Works' Indonesian estimate with Sea's company-wide monetization rate. In 2023, Tokopedia, Shopee and Grab together processed US$43.23 billion of transaction value against US$3.16 billion of recognized revenue, a wedge of US$40.07 billion. BPS-Statistics Indonesia, the national statistical agency, placed the marketplace component of e-commerce at about US$13.2 billion and all e-commerce at US$72.3 billion. These records are not yet directly comparable because their definitions and scopes differ. Each answers a different question; quoting one as the size of the digital economy means choosing a particular record.</w:t>
+        <w:t>Indonesia, the largest digital market in Southeast Asia, shows how far apart these records are. The study covers four marketplaces—Tokopedia, Blibli, Bukalapak and Shopee—plus Grab, whose Indonesian business is mainly delivery and other on-demand services. Tokopedia, Blibli and Bukalapak report both measures themselves. Grab's transaction value uses Indonesian revenue and its company-wide ratio; Shopee combines Momentum Works' Indonesian estimate with Sea's company-wide monetization rate. In 2023, Tokopedia, Shopee and Grab together processed US$43.23 billion of transaction value against US$3.16 billion of recognized revenue, a wedge of US$40.07 billion. BPS-Statistics Indonesia, the national statistical agency, placed the marketplace component of e-commerce at about US$13.2 billion and all e-commerce at US$72.3 billion. Only platform transaction value and revenue enter W; BPS and payment data are independent comparison records. Their definitions and scopes differ, so they are not yet directly comparable. Each answers a different question; quoting one as the size of the digital economy means choosing a particular record.</w:t>
       </w:r>
     </w:p>
     <w:p>
@@ -231,7 +231,7 @@
           <w:i w:val="0"/>
           <w:sz w:val="24"/>
         </w:rPr>
-        <w:t>The records also disagree about growth. Between 2022 and 2023, Tokopedia's revenue rose 53.2 percent while the transaction value it processed fell 8.9 percent: read through its accounts the platform was expanding quickly, read through its transactions it was shrinking. The reversal is not isolated. Among the three platforms that report both figures themselves, revenue grew faster than transaction value in six of eight year-to-year comparisons between 2020 and 2025, and the two moved in opposite directions twice. Nationally, BPS reports e-commerce value up 17.1 percent between 2023 and 2024, with 98.5 percent of the increase outside BPS's marketplace category, while economy-wide payment measures from Bank Indonesia, the central bank, grew between 1.8 and 11 times as fast.</w:t>
+        <w:t>The records also disagree about growth. Between 2022 and 2023, Tokopedia's revenue rose 53.2 percent while the transaction value it processed fell 8.9 percent: read through its accounts the platform was expanding quickly, read through its transactions it was shrinking. The reversal is not isolated. Among the three platforms that report both figures themselves, revenue grew faster than transaction value in six of eight year-to-year comparisons between 2020 and 2025, and the two moved in opposite directions twice. Nationally, BPS reports e-commerce value up 17.1 percent between 2023 and 2024, with 98.5 percent of the increase outside BPS's marketplace category, while economy-wide payment measures from Bank Indonesia, the central bank, grew between 1.8 and 11 times as fast. The wedge establishes scale; the central test is whether revenue remains a stable guide to the commerce underneath it.</w:t>
       </w:r>
     </w:p>
     <w:p>
@@ -958,7 +958,7 @@
           <w:i w:val="0"/>
           <w:sz w:val="24"/>
         </w:rPr>
-        <w:t>An E of 9 means that nine units of transaction value lie outside the revenue line for every unit recognized as platform revenue. E contains the same information as the platform's monetization rate, t = R/V, because E = 1/t − 1. The residual form matches the research question, which concerns commerce outside recognized revenue.</w:t>
+        <w:t>An E of 9 means that nine units of transaction value lie outside the revenue line for every unit recognized as platform revenue. E contains the same information as the platform's monetization rate, t = R/V, because E = 1/t − 1. For example, a platform that recognizes 2.5 percent of transaction value as revenue has an E of 39. The residual form matches the research question, which concerns commerce outside recognized revenue.</w:t>
       </w:r>
     </w:p>
     <w:p>
@@ -973,7 +973,7 @@
           <w:i w:val="0"/>
           <w:sz w:val="24"/>
         </w:rPr>
-        <w:t>The Ecosystem Ratio is a descriptive transformation constructed for this study, not a new underlying economic quantity or a measure adopted from prior work. Its interpretation rests on the platform-economics result that booked revenue need not track the transaction value a multisided platform coordinates (Rochet and Tirole 2003; Hagiu and Wright 2015; Evans and Schmalensee 2016), together with the accounting result that the share entering revenue depends on how revenue is recognized, including whether the platform acts as principal or agent (International Accounting Standards Board 2014; De Franco, Kothari and Verdi 2011).</w:t>
+        <w:t>The Ecosystem Ratio is constructed for this study as a descriptive transformation of the monetization rate. Its interpretation rests on the platform-economics result that booked revenue need not track the transaction value a multisided platform coordinates (Rochet and Tirole 2003; Hagiu and Wright 2015; Evans and Schmalensee 2016), together with the accounting result that the share entering revenue depends on how revenue is recognized, including whether the platform acts as principal or agent (International Accounting Standards Board 2014; De Franco, Kothari and Verdi 2011).</w:t>
       </w:r>
     </w:p>
     <w:p>
@@ -3760,7 +3760,7 @@
           <w:i w:val="0"/>
           <w:sz w:val="24"/>
         </w:rPr>
-        <w:t>Robustness checks vary the admission rules, revenue definitions, publication versions, and the assumptions in the constructed country measures. The resulting ranges are reported as sensitivity ranges rather than statistical confidence intervals.</w:t>
+        <w:t>Robustness checks vary the sample-inclusion rules, revenue definitions, publication versions, and the assumptions in the constructed country measures. The resulting ranges are reported as sensitivity ranges rather than statistical confidence intervals.</w:t>
       </w:r>
     </w:p>
     <w:p>
@@ -4816,7 +4816,7 @@
           <w:i w:val="0"/>
           <w:sz w:val="24"/>
         </w:rPr>
-        <w:t>The relationship is not stable. Revenue grew faster in six of eight main-sample comparisons; the median absolute gap is 38.92 percentage points, with two reversals. Tokopedia's 53.2 percent revenue growth against an 8.9 percent transaction-value decline gives a 62.1-point divergence. Dropping the largest comparison leaves five of seven and a 15.74-point median; every leave-one-out sample retains a majority and a reversal. Adding Grab and Shopee gives ten of twelve, but those four comparisons track company-wide monetization. Figure 1 shows E for each platform; every series ends lower than it began, though not steadily.</w:t>
+        <w:t>The relationship is not stable. Revenue grew faster in six of the eight main-sample comparisons, and the median absolute gap between the two growth rates was 38.92 percentage points. In two comparisons, revenue and transaction value moved in opposite directions. Tokopedia's 53.2 percent revenue growth against an 8.9 percent transaction-value decline gives a 62.1-point divergence. After dropping the largest comparison, revenue still grew faster in five of seven, with a median gap of 15.74 points. Every leave-one-out sample retains both a majority and at least one reversal. Adding Grab and Shopee gives ten of twelve, but those four comparisons track company-wide monetization. Figure 1 traces E for each platform; every series ends below its starting point, although the decline is not monotonic in every case.</w:t>
       </w:r>
     </w:p>
     <w:p>
@@ -4892,7 +4892,7 @@
           <w:i w:val="0"/>
           <w:sz w:val="24"/>
         </w:rPr>
-        <w:t>Tokopedia illustrates the separation. In 2022–2023, transaction value fell 8.9 percent while third-party net revenue rose 53.2 percent; 60.6 percent of the revenue increase reconciles to lower customer incentives and 39.4 percent to higher gross revenue. Its accounts show growth while its transactions show contraction. Blibli similarly reversed in 2024–2025: transaction value fell 1.89 percent and net revenue rose 12.07 percent. Its revenue components remain unreconciled.</w:t>
+        <w:t>Tokopedia illustrates the separation. In 2022–2023, transaction value fell 8.9 percent while third-party net revenue rose 53.2 percent; 60.6 percent of the revenue increase reconciles to lower customer incentives and 39.4 percent to higher gross revenue. Its accounts show growth while its transactions show contraction. Blibli similarly reversed in 2024–2025: transaction value fell 1.89 percent and net revenue rose 12.07 percent. The pattern therefore appears in more than one platform and period.</w:t>
       </w:r>
     </w:p>
     <w:p>
@@ -4925,7 +4925,7 @@
           <w:i w:val="0"/>
           <w:sz w:val="24"/>
         </w:rPr>
-        <w:t>National statistics give a different account of the same commerce, beginning with its level. BPS measures online sales reported by surveyed e-commerce businesses; Tokopedia reports GTV, while the external Shopee figure is a GMV estimate. For 2023, BPS places the marketplace component at Rp200.68 trillion, about US$13.2 billion, in its exclusive channel split, where marketplaces account for 18.2 percent of transaction value. Tokopedia's reported GTV and the external Shopee estimate total US$37.9 billion. Because channel attribution and reporting definitions differ, the records are not yet like-for-like. The thesis will reconcile those definitions before attributing any part of the difference to coverage.</w:t>
+        <w:t>National statistics give a different account of the same commerce, beginning with its level. BPS measures online sales reported by surveyed e-commerce businesses; Tokopedia reports GTV, while the external Shopee figure is a GMV estimate. For 2023, BPS places the marketplace component at Rp200.68 trillion, about US$13.2 billion, in its exclusive channel split, where marketplaces account for 18.2 percent of e-commerce value. Tokopedia's reported GTV and the external Shopee estimate total US$37.9 billion. Because channel attribution and reporting definitions differ, the records are not yet like-for-like. The thesis will reconcile those definitions before attributing any part of the difference to coverage.</w:t>
       </w:r>
     </w:p>
     <w:p>
@@ -5541,7 +5541,7 @@
           <w:i w:val="0"/>
           <w:sz w:val="24"/>
         </w:rPr>
-        <w:t>Indonesia's digital economy is observed through platform accounts, transaction measures, national statistics and payment records, which disagree about scale and growth. Revenue alone can reverse the apparent direction of platform activity, while a marketplace measure can show a different trend from all e-commerce. The contribution is to identify which conclusions depend on the record selected and why no fixed conversion from platform revenue can recover the commerce underneath it.</w:t>
+        <w:t>Indonesia's digital economy is observed through platform accounts, transaction measures, national statistics and payment records, which disagree about scale and growth. Tokopedia's transaction value fell 8.9 percent while its revenue rose 53.2 percent, and BPS's marketplace category grew 1.45 percent while all e-commerce grew 17.08 percent. The contribution is to identify which conclusions depend on the record selected and why no fixed conversion from platform revenue can recover the commerce underneath it.</w:t>
       </w:r>
     </w:p>
     <w:p>
@@ -6107,7 +6107,7 @@
           <w:i w:val="0"/>
           <w:sz w:val="24"/>
         </w:rPr>
-        <w:t>The data and empirical framework are assembled. The remaining work will reconcile the definitions behind the BPS and platform levels, divide movements in the wedge into transaction-volume and monetization effects, test alternative admission rules, and complete the robustness checks. Table 8 sets out that schedule.</w:t>
+        <w:t>The data and empirical framework are assembled. The remaining work will reconcile the definitions behind the BPS and platform levels, divide movements in the wedge into transaction-volume and monetization effects, test alternative sample-inclusion rules, and complete the robustness checks. Table 8 sets out that schedule.</w:t>
       </w:r>
     </w:p>
     <w:p>
@@ -6404,7 +6404,7 @@
           <w:i w:val="0"/>
           <w:sz w:val="24"/>
         </w:rPr>
-        <w:t>Indonesia's digital economy is observed through several records that measure different objects. The preliminary evidence shows that those records disagree about its size, growth and, in some cases, direction. This thesis measures that disagreement, tests whether the relationship between revenue and transaction value remains stable, and identifies which conclusions depend on the record chosen.</w:t>
+        <w:t>The thesis treats the choice of record as an empirical question. It measures how far the records disagree, tests whether the relationship between revenue and transaction value remains stable, and identifies which conclusions about the size, growth and direction of digital activity depend on the record chosen.</w:t>
       </w:r>
     </w:p>
     <w:p>

</xml_diff>